<commit_message>
Add final summary email previews and editor email helper.
Archive per-athlete HTML previews and validation JSON from the 2026 close-out email build, plus stage reports and a Belgrade packet editor-email docx generator.

Co-authored-by: Cursor <cursoragent@cursor.com>
</commit_message>
<xml_diff>
--- a/tools/airtable/_preview/newspaper-radio-prep/final-packets/03-north-central-montana/01 Article - Main Version.docx
+++ b/tools/airtable/_preview/newspaper-radio-prep/final-packets/03-north-central-montana/01 Article - Main Version.docx
@@ -56,6 +56,19 @@
       <w:r>
         <w:t xml:space="preserve"> Bakken, a 10th-grade student who reached Developing Shooter, Level 3 of 12, with 18,110 counted shots. Bakken also earned a Conquered Goal Award after surpassing his official shooting goal. His total was one of the largest in the challenge and showed the kind of commitment required to stay with the program through the final week.</w:t>
       </w:r>
+      <w:r>
+        <w:t xml:space="preserve">  </w:t>
+      </w:r>
+      <w:proofErr w:type="spellStart"/>
+      <w:r>
+        <w:t>Leyton</w:t>
+      </w:r>
+      <w:proofErr w:type="spellEnd"/>
+      <w:r>
+        <w:t xml:space="preserve"> was the current two time defending champion of the shooting challenge.</w:t>
+      </w:r>
+      <w:bookmarkStart w:id="0" w:name="_GoBack"/>
+      <w:bookmarkEnd w:id="0"/>
     </w:p>
     <w:p/>
     <w:p>
@@ -335,8 +348,6 @@
       <w:r>
         <w:t>Together, the group represented what the Shooting Challenge was built to encourage: shooting work, consistency, accountability, and a willingness to keep improving.</w:t>
       </w:r>
-      <w:bookmarkStart w:id="0" w:name="_GoBack"/>
-      <w:bookmarkEnd w:id="0"/>
     </w:p>
     <w:sectPr>
       <w:pgSz w:w="12240" w:h="15840"/>

</xml_diff>